<commit_message>
Close native cleanup and diagnostics gaps with stronger layout gates
</commit_message>
<xml_diff>
--- a/docs/verification/msoffice-production/macos-word/generated.docx
+++ b/docs/verification/msoffice-production/macos-word/generated.docx
@@ -81,7 +81,7 @@
       <w:r>
         <w:fldChar w:fldCharType="separate"/>
       </w:r>
-      <w:hyperlink w:anchor="_Toc239779855" w:history="1">
+      <w:hyperlink w:anchor="_Toc239781552" w:history="1">
         <w:r>
           <w:rPr>
             <w:rStyle w:val="af4"/>
@@ -122,7 +122,7 @@
             <w:noProof/>
             <w:webHidden/>
           </w:rPr>
-          <w:instrText xml:space="preserve"> PAGEREF _Toc239779855 \h </w:instrText>
+          <w:instrText xml:space="preserve"> PAGEREF _Toc239781552 \h </w:instrText>
         </w:r>
         <w:r>
           <w:rPr>
@@ -166,7 +166,7 @@
           <w:sz w:val="22"/>
         </w:rPr>
       </w:pPr>
-      <w:hyperlink w:anchor="_Toc239779856" w:history="1">
+      <w:hyperlink w:anchor="_Toc239781553" w:history="1">
         <w:r>
           <w:rPr>
             <w:rStyle w:val="af4"/>
@@ -207,7 +207,7 @@
             <w:noProof/>
             <w:webHidden/>
           </w:rPr>
-          <w:instrText xml:space="preserve"> PAGEREF _Toc239779856 \h </w:instrText>
+          <w:instrText xml:space="preserve"> PAGEREF _Toc239781553 \h </w:instrText>
         </w:r>
         <w:r>
           <w:rPr>
@@ -251,7 +251,7 @@
           <w:sz w:val="22"/>
         </w:rPr>
       </w:pPr>
-      <w:hyperlink w:anchor="_Toc239779857" w:history="1">
+      <w:hyperlink w:anchor="_Toc239781554" w:history="1">
         <w:r>
           <w:rPr>
             <w:rStyle w:val="af4"/>
@@ -292,7 +292,7 @@
             <w:noProof/>
             <w:webHidden/>
           </w:rPr>
-          <w:instrText xml:space="preserve"> PAGEREF _Toc239779857 \h </w:instrText>
+          <w:instrText xml:space="preserve"> PAGEREF _Toc239781554 \h </w:instrText>
         </w:r>
         <w:r>
           <w:rPr>
@@ -347,7 +347,7 @@
         <w:pStyle w:val="1"/>
       </w:pPr>
       <w:bookmarkStart w:id="3" w:name="wpsc_head_1ead318c9153d2c4062e0fb8"/>
-      <w:bookmarkStart w:id="4" w:name="_Toc239779855"/>
+      <w:bookmarkStart w:id="4" w:name="_Toc239781552"/>
       <w:r>
         <w:rPr>
           <w:rFonts w:hint="eastAsia"/>
@@ -375,7 +375,7 @@
         <w:pStyle w:val="2"/>
       </w:pPr>
       <w:bookmarkStart w:id="6" w:name="wpsc_head_c2487b182cc4424a40da5018"/>
-      <w:bookmarkStart w:id="7" w:name="_Toc239779856"/>
+      <w:bookmarkStart w:id="7" w:name="_Toc239781553"/>
       <w:bookmarkEnd w:id="5"/>
       <w:r>
         <w:rPr>
@@ -409,7 +409,7 @@
         <w:pStyle w:val="3"/>
       </w:pPr>
       <w:bookmarkStart w:id="9" w:name="wpsc_head_c3cd18d3271698c4dbe5c68e"/>
-      <w:bookmarkStart w:id="10" w:name="_Toc239779857"/>
+      <w:bookmarkStart w:id="10" w:name="_Toc239781554"/>
       <w:bookmarkEnd w:id="8"/>
       <w:r>
         <w:rPr>
@@ -3987,7 +3987,7 @@
       <w:rPr>
         <w:noProof/>
       </w:rPr>
-      <w:t>ii</w:t>
+      <w:t>i</w:t>
     </w:r>
     <w:r>
       <w:fldChar w:fldCharType="end"/>
@@ -4079,10 +4079,365 @@
 <file path=word/numbering.xml><?xml version="1.0" encoding="utf-8"?>
 <w:numbering xmlns:wpc="http://schemas.microsoft.com/office/word/2010/wordprocessingCanvas" xmlns:cx="http://schemas.microsoft.com/office/drawing/2014/chartex" xmlns:cx1="http://schemas.microsoft.com/office/drawing/2015/9/8/chartex" xmlns:cx2="http://schemas.microsoft.com/office/drawing/2015/10/21/chartex" xmlns:cx3="http://schemas.microsoft.com/office/drawing/2016/5/9/chartex" xmlns:cx4="http://schemas.microsoft.com/office/drawing/2016/5/10/chartex" xmlns:cx5="http://schemas.microsoft.com/office/drawing/2016/5/11/chartex" xmlns:cx6="http://schemas.microsoft.com/office/drawing/2016/5/12/chartex" xmlns:cx7="http://schemas.microsoft.com/office/drawing/2016/5/13/chartex" xmlns:cx8="http://schemas.microsoft.com/office/drawing/2016/5/14/chartex" xmlns:mc="http://schemas.openxmlformats.org/markup-compatibility/2006" xmlns:m="http://schemas.openxmlformats.org/officeDocument/2006/math" xmlns:aink="http://schemas.microsoft.com/office/drawing/2016/ink" xmlns:am3d="http://schemas.microsoft.com/office/drawing/2017/model3d" xmlns:oel="http://schemas.microsoft.com/office/2019/extlst" xmlns:r="http://schemas.openxmlformats.org/officeDocument/2006/relationships" xmlns:wp14="http://schemas.microsoft.com/office/word/2010/wordprocessingDrawing" xmlns:wp="http://schemas.openxmlformats.org/drawingml/2006/wordprocessingDrawing" xmlns:wpg="http://schemas.microsoft.com/office/word/2010/wordprocessingGroup" xmlns:wpi="http://schemas.microsoft.com/office/word/2010/wordprocessingInk" xmlns:wps="http://schemas.microsoft.com/office/word/2010/wordprocessingShape" xmlns:o="urn:schemas-microsoft-com:office:office" xmlns:v="urn:schemas-microsoft-com:vml" xmlns:w10="urn:schemas-microsoft-com:office:word" xmlns:w="http://schemas.openxmlformats.org/wordprocessingml/2006/main" xmlns:w14="http://schemas.microsoft.com/office/word/2010/wordml" xmlns:w15="http://schemas.microsoft.com/office/word/2012/wordml" xmlns:w16cex="http://schemas.microsoft.com/office/word/2018/wordml/cex" xmlns:w16cid="http://schemas.microsoft.com/office/word/2016/wordml/cid" xmlns:w16="http://schemas.microsoft.com/office/word/2018/wordml" xmlns:w16sdtdh="http://schemas.microsoft.com/office/word/2020/wordml/sdtdatahash" xmlns:w16sdtfl="http://schemas.microsoft.com/office/word/2024/wordml/sdtformatlock" xmlns:w16se="http://schemas.microsoft.com/office/word/2015/wordml/symex" xmlns:w16du="http://schemas.microsoft.com/office/word/2023/wordml/word16du" xmlns:wne="http://schemas.microsoft.com/office/word/2006/wordml" mc:Ignorable="w14 w15 w16se w16cid w16 w16cex w16sdtdh w16sdtfl w16du wp14">
   <w:abstractNum w:abstractNumId="0" w15:restartNumberingAfterBreak="0">
-    <w:nsid w:val="04D63CCC"/>
+    <w:nsid w:val="10A00309"/>
     <w:multiLevelType w:val="multilevel"/>
-    <w:tmpl w:val="2F3C5820"/>
-    <w:name w:val="WPSCNativeOutline223"/>
+    <w:tmpl w:val="44DE8040"/>
+    <w:name w:val="WPSCNativeOutline"/>
+    <w:lvl w:ilvl="0">
+      <w:start w:val="1"/>
+      <w:numFmt w:val="decimal"/>
+      <w:lvlRestart w:val="0"/>
+      <w:lvlText w:val="%1"/>
+      <w:lvlJc w:val="left"/>
+      <w:pPr>
+        <w:ind w:left="425" w:hanging="425"/>
+      </w:pPr>
+    </w:lvl>
+    <w:lvl w:ilvl="1">
+      <w:start w:val="1"/>
+      <w:numFmt w:val="decimal"/>
+      <w:lvlText w:val="%1.%2"/>
+      <w:lvlJc w:val="left"/>
+      <w:pPr>
+        <w:ind w:left="992" w:hanging="567"/>
+      </w:pPr>
+    </w:lvl>
+    <w:lvl w:ilvl="2">
+      <w:start w:val="1"/>
+      <w:numFmt w:val="decimal"/>
+      <w:lvlText w:val="%1.%2.%3"/>
+      <w:lvlJc w:val="left"/>
+      <w:pPr>
+        <w:ind w:left="1418" w:hanging="567"/>
+      </w:pPr>
+    </w:lvl>
+    <w:lvl w:ilvl="3">
+      <w:start w:val="1"/>
+      <w:numFmt w:val="decimal"/>
+      <w:lvlText w:val="%1.%2.%3.%4"/>
+      <w:lvlJc w:val="left"/>
+      <w:pPr>
+        <w:ind w:left="1984" w:hanging="708"/>
+      </w:pPr>
+    </w:lvl>
+    <w:lvl w:ilvl="4">
+      <w:start w:val="1"/>
+      <w:numFmt w:val="decimal"/>
+      <w:lvlText w:val="%1.%2.%3.%4.%5"/>
+      <w:lvlJc w:val="left"/>
+      <w:pPr>
+        <w:ind w:left="2551" w:hanging="850"/>
+      </w:pPr>
+    </w:lvl>
+    <w:lvl w:ilvl="5">
+      <w:start w:val="1"/>
+      <w:numFmt w:val="decimal"/>
+      <w:lvlText w:val="%1.%2.%3.%4.%5.%6"/>
+      <w:lvlJc w:val="left"/>
+      <w:pPr>
+        <w:ind w:left="3260" w:hanging="1134"/>
+      </w:pPr>
+    </w:lvl>
+    <w:lvl w:ilvl="6">
+      <w:start w:val="1"/>
+      <w:numFmt w:val="decimal"/>
+      <w:lvlText w:val="%1.%2.%3.%4.%5.%6.%7"/>
+      <w:lvlJc w:val="left"/>
+      <w:pPr>
+        <w:ind w:left="3827" w:hanging="1276"/>
+      </w:pPr>
+    </w:lvl>
+    <w:lvl w:ilvl="7">
+      <w:start w:val="1"/>
+      <w:numFmt w:val="decimal"/>
+      <w:lvlText w:val="%1.%2.%3.%4.%5.%6.%7.%8"/>
+      <w:lvlJc w:val="left"/>
+      <w:pPr>
+        <w:ind w:left="4394" w:hanging="1418"/>
+      </w:pPr>
+    </w:lvl>
+    <w:lvl w:ilvl="8">
+      <w:start w:val="1"/>
+      <w:numFmt w:val="decimal"/>
+      <w:lvlText w:val="%1.%2.%3.%4.%5.%6.%7.%8.%9"/>
+      <w:lvlJc w:val="left"/>
+      <w:pPr>
+        <w:ind w:left="5102" w:hanging="1700"/>
+      </w:pPr>
+    </w:lvl>
+  </w:abstractNum>
+  <w:abstractNum w:abstractNumId="1" w15:restartNumberingAfterBreak="0">
+    <w:nsid w:val="2ECF08D6"/>
+    <w:multiLevelType w:val="multilevel"/>
+    <w:tmpl w:val="0C183D7A"/>
+    <w:name w:val="WPSCNativeOutline4"/>
+    <w:lvl w:ilvl="0">
+      <w:start w:val="1"/>
+      <w:numFmt w:val="decimal"/>
+      <w:lvlRestart w:val="0"/>
+      <w:lvlText w:val="%1"/>
+      <w:lvlJc w:val="left"/>
+      <w:pPr>
+        <w:ind w:left="425" w:hanging="425"/>
+      </w:pPr>
+    </w:lvl>
+    <w:lvl w:ilvl="1">
+      <w:start w:val="1"/>
+      <w:numFmt w:val="decimal"/>
+      <w:lvlText w:val="%1.%2"/>
+      <w:lvlJc w:val="left"/>
+      <w:pPr>
+        <w:ind w:left="992" w:hanging="567"/>
+      </w:pPr>
+    </w:lvl>
+    <w:lvl w:ilvl="2">
+      <w:start w:val="1"/>
+      <w:numFmt w:val="decimal"/>
+      <w:pStyle w:val="3"/>
+      <w:lvlText w:val="%1.%2.%3"/>
+      <w:lvlJc w:val="left"/>
+      <w:pPr>
+        <w:ind w:left="1418" w:hanging="567"/>
+      </w:pPr>
+    </w:lvl>
+    <w:lvl w:ilvl="3">
+      <w:start w:val="1"/>
+      <w:numFmt w:val="decimal"/>
+      <w:lvlText w:val="%1.%2.%3.%4"/>
+      <w:lvlJc w:val="left"/>
+      <w:pPr>
+        <w:ind w:left="1984" w:hanging="708"/>
+      </w:pPr>
+    </w:lvl>
+    <w:lvl w:ilvl="4">
+      <w:start w:val="1"/>
+      <w:numFmt w:val="decimal"/>
+      <w:lvlText w:val="%1.%2.%3.%4.%5"/>
+      <w:lvlJc w:val="left"/>
+      <w:pPr>
+        <w:ind w:left="2551" w:hanging="850"/>
+      </w:pPr>
+    </w:lvl>
+    <w:lvl w:ilvl="5">
+      <w:start w:val="1"/>
+      <w:numFmt w:val="decimal"/>
+      <w:lvlText w:val="%1.%2.%3.%4.%5.%6"/>
+      <w:lvlJc w:val="left"/>
+      <w:pPr>
+        <w:ind w:left="3260" w:hanging="1134"/>
+      </w:pPr>
+    </w:lvl>
+    <w:lvl w:ilvl="6">
+      <w:start w:val="1"/>
+      <w:numFmt w:val="decimal"/>
+      <w:lvlText w:val="%1.%2.%3.%4.%5.%6.%7"/>
+      <w:lvlJc w:val="left"/>
+      <w:pPr>
+        <w:ind w:left="3827" w:hanging="1276"/>
+      </w:pPr>
+    </w:lvl>
+    <w:lvl w:ilvl="7">
+      <w:start w:val="1"/>
+      <w:numFmt w:val="decimal"/>
+      <w:lvlText w:val="%1.%2.%3.%4.%5.%6.%7.%8"/>
+      <w:lvlJc w:val="left"/>
+      <w:pPr>
+        <w:ind w:left="4394" w:hanging="1418"/>
+      </w:pPr>
+    </w:lvl>
+    <w:lvl w:ilvl="8">
+      <w:start w:val="1"/>
+      <w:numFmt w:val="decimal"/>
+      <w:lvlText w:val="%1.%2.%3.%4.%5.%6.%7.%8.%9"/>
+      <w:lvlJc w:val="left"/>
+      <w:pPr>
+        <w:ind w:left="5102" w:hanging="1700"/>
+      </w:pPr>
+    </w:lvl>
+  </w:abstractNum>
+  <w:abstractNum w:abstractNumId="2" w15:restartNumberingAfterBreak="0">
+    <w:nsid w:val="3BAF6E9C"/>
+    <w:multiLevelType w:val="multilevel"/>
+    <w:tmpl w:val="406CF3C6"/>
+    <w:name w:val="WPSCNativeOutline2"/>
+    <w:lvl w:ilvl="0">
+      <w:start w:val="1"/>
+      <w:numFmt w:val="decimal"/>
+      <w:lvlRestart w:val="0"/>
+      <w:pStyle w:val="1"/>
+      <w:lvlText w:val="%1"/>
+      <w:lvlJc w:val="left"/>
+      <w:pPr>
+        <w:ind w:left="425" w:hanging="425"/>
+      </w:pPr>
+    </w:lvl>
+    <w:lvl w:ilvl="1">
+      <w:start w:val="1"/>
+      <w:numFmt w:val="decimal"/>
+      <w:lvlText w:val="%1.%2"/>
+      <w:lvlJc w:val="left"/>
+      <w:pPr>
+        <w:ind w:left="992" w:hanging="567"/>
+      </w:pPr>
+    </w:lvl>
+    <w:lvl w:ilvl="2">
+      <w:start w:val="1"/>
+      <w:numFmt w:val="decimal"/>
+      <w:lvlText w:val="%1.%2.%3"/>
+      <w:lvlJc w:val="left"/>
+      <w:pPr>
+        <w:ind w:left="1418" w:hanging="567"/>
+      </w:pPr>
+    </w:lvl>
+    <w:lvl w:ilvl="3">
+      <w:start w:val="1"/>
+      <w:numFmt w:val="decimal"/>
+      <w:lvlText w:val="%1.%2.%3.%4"/>
+      <w:lvlJc w:val="left"/>
+      <w:pPr>
+        <w:ind w:left="1984" w:hanging="708"/>
+      </w:pPr>
+    </w:lvl>
+    <w:lvl w:ilvl="4">
+      <w:start w:val="1"/>
+      <w:numFmt w:val="decimal"/>
+      <w:lvlText w:val="%1.%2.%3.%4.%5"/>
+      <w:lvlJc w:val="left"/>
+      <w:pPr>
+        <w:ind w:left="2551" w:hanging="850"/>
+      </w:pPr>
+    </w:lvl>
+    <w:lvl w:ilvl="5">
+      <w:start w:val="1"/>
+      <w:numFmt w:val="decimal"/>
+      <w:lvlText w:val="%1.%2.%3.%4.%5.%6"/>
+      <w:lvlJc w:val="left"/>
+      <w:pPr>
+        <w:ind w:left="3260" w:hanging="1134"/>
+      </w:pPr>
+    </w:lvl>
+    <w:lvl w:ilvl="6">
+      <w:start w:val="1"/>
+      <w:numFmt w:val="decimal"/>
+      <w:lvlText w:val="%1.%2.%3.%4.%5.%6.%7"/>
+      <w:lvlJc w:val="left"/>
+      <w:pPr>
+        <w:ind w:left="3827" w:hanging="1276"/>
+      </w:pPr>
+    </w:lvl>
+    <w:lvl w:ilvl="7">
+      <w:start w:val="1"/>
+      <w:numFmt w:val="decimal"/>
+      <w:lvlText w:val="%1.%2.%3.%4.%5.%6.%7.%8"/>
+      <w:lvlJc w:val="left"/>
+      <w:pPr>
+        <w:ind w:left="4394" w:hanging="1418"/>
+      </w:pPr>
+    </w:lvl>
+    <w:lvl w:ilvl="8">
+      <w:start w:val="1"/>
+      <w:numFmt w:val="decimal"/>
+      <w:lvlText w:val="%1.%2.%3.%4.%5.%6.%7.%8.%9"/>
+      <w:lvlJc w:val="left"/>
+      <w:pPr>
+        <w:ind w:left="5102" w:hanging="1700"/>
+      </w:pPr>
+    </w:lvl>
+  </w:abstractNum>
+  <w:abstractNum w:abstractNumId="3" w15:restartNumberingAfterBreak="0">
+    <w:nsid w:val="4A73578B"/>
+    <w:multiLevelType w:val="multilevel"/>
+    <w:tmpl w:val="60F86FD2"/>
+    <w:name w:val="WPSCNativeOutline3"/>
+    <w:lvl w:ilvl="0">
+      <w:start w:val="1"/>
+      <w:numFmt w:val="decimal"/>
+      <w:lvlRestart w:val="0"/>
+      <w:lvlText w:val="%1"/>
+      <w:lvlJc w:val="left"/>
+      <w:pPr>
+        <w:ind w:left="425" w:hanging="425"/>
+      </w:pPr>
+    </w:lvl>
+    <w:lvl w:ilvl="1">
+      <w:start w:val="1"/>
+      <w:numFmt w:val="decimal"/>
+      <w:pStyle w:val="2"/>
+      <w:lvlText w:val="%1.%2"/>
+      <w:lvlJc w:val="left"/>
+      <w:pPr>
+        <w:ind w:left="992" w:hanging="567"/>
+      </w:pPr>
+    </w:lvl>
+    <w:lvl w:ilvl="2">
+      <w:start w:val="1"/>
+      <w:numFmt w:val="decimal"/>
+      <w:lvlText w:val="%1.%2.%3"/>
+      <w:lvlJc w:val="left"/>
+      <w:pPr>
+        <w:ind w:left="1418" w:hanging="567"/>
+      </w:pPr>
+    </w:lvl>
+    <w:lvl w:ilvl="3">
+      <w:start w:val="1"/>
+      <w:numFmt w:val="decimal"/>
+      <w:lvlText w:val="%1.%2.%3.%4"/>
+      <w:lvlJc w:val="left"/>
+      <w:pPr>
+        <w:ind w:left="1984" w:hanging="708"/>
+      </w:pPr>
+    </w:lvl>
+    <w:lvl w:ilvl="4">
+      <w:start w:val="1"/>
+      <w:numFmt w:val="decimal"/>
+      <w:lvlText w:val="%1.%2.%3.%4.%5"/>
+      <w:lvlJc w:val="left"/>
+      <w:pPr>
+        <w:ind w:left="2551" w:hanging="850"/>
+      </w:pPr>
+    </w:lvl>
+    <w:lvl w:ilvl="5">
+      <w:start w:val="1"/>
+      <w:numFmt w:val="decimal"/>
+      <w:lvlText w:val="%1.%2.%3.%4.%5.%6"/>
+      <w:lvlJc w:val="left"/>
+      <w:pPr>
+        <w:ind w:left="3260" w:hanging="1134"/>
+      </w:pPr>
+    </w:lvl>
+    <w:lvl w:ilvl="6">
+      <w:start w:val="1"/>
+      <w:numFmt w:val="decimal"/>
+      <w:lvlText w:val="%1.%2.%3.%4.%5.%6.%7"/>
+      <w:lvlJc w:val="left"/>
+      <w:pPr>
+        <w:ind w:left="3827" w:hanging="1276"/>
+      </w:pPr>
+    </w:lvl>
+    <w:lvl w:ilvl="7">
+      <w:start w:val="1"/>
+      <w:numFmt w:val="decimal"/>
+      <w:lvlText w:val="%1.%2.%3.%4.%5.%6.%7.%8"/>
+      <w:lvlJc w:val="left"/>
+      <w:pPr>
+        <w:ind w:left="4394" w:hanging="1418"/>
+      </w:pPr>
+    </w:lvl>
+    <w:lvl w:ilvl="8">
+      <w:start w:val="1"/>
+      <w:numFmt w:val="decimal"/>
+      <w:lvlText w:val="%1.%2.%3.%4.%5.%6.%7.%8.%9"/>
+      <w:lvlJc w:val="left"/>
+      <w:pPr>
+        <w:ind w:left="5102" w:hanging="1700"/>
+      </w:pPr>
+    </w:lvl>
+  </w:abstractNum>
+  <w:abstractNum w:abstractNumId="4" w15:restartNumberingAfterBreak="0">
+    <w:nsid w:val="5EDC767D"/>
+    <w:multiLevelType w:val="multilevel"/>
+    <w:tmpl w:val="4D6ECE8A"/>
+    <w:name w:val="WPSCNativeOutline5"/>
     <w:lvl w:ilvl="0">
       <w:start w:val="1"/>
       <w:numFmt w:val="decimal"/>
@@ -4167,375 +4522,20 @@
       </w:pPr>
     </w:lvl>
   </w:abstractNum>
-  <w:abstractNum w:abstractNumId="1" w15:restartNumberingAfterBreak="0">
-    <w:nsid w:val="1C465963"/>
-    <w:multiLevelType w:val="multilevel"/>
-    <w:tmpl w:val="E3DE5FC0"/>
-    <w:name w:val="WPSCNativeOutline22"/>
-    <w:lvl w:ilvl="0">
-      <w:start w:val="1"/>
-      <w:numFmt w:val="decimal"/>
-      <w:lvlRestart w:val="0"/>
-      <w:lvlText w:val="%1"/>
-      <w:lvlJc w:val="left"/>
-      <w:pPr>
-        <w:ind w:left="425" w:hanging="425"/>
-      </w:pPr>
-    </w:lvl>
-    <w:lvl w:ilvl="1">
-      <w:start w:val="1"/>
-      <w:numFmt w:val="decimal"/>
-      <w:lvlText w:val="%1.%2"/>
-      <w:lvlJc w:val="left"/>
-      <w:pPr>
-        <w:ind w:left="992" w:hanging="567"/>
-      </w:pPr>
-    </w:lvl>
-    <w:lvl w:ilvl="2">
-      <w:start w:val="1"/>
-      <w:numFmt w:val="decimal"/>
-      <w:lvlText w:val="%1.%2.%3"/>
-      <w:lvlJc w:val="left"/>
-      <w:pPr>
-        <w:ind w:left="1418" w:hanging="567"/>
-      </w:pPr>
-    </w:lvl>
-    <w:lvl w:ilvl="3">
-      <w:start w:val="1"/>
-      <w:numFmt w:val="decimal"/>
-      <w:lvlText w:val="%1.%2.%3.%4"/>
-      <w:lvlJc w:val="left"/>
-      <w:pPr>
-        <w:ind w:left="1984" w:hanging="708"/>
-      </w:pPr>
-    </w:lvl>
-    <w:lvl w:ilvl="4">
-      <w:start w:val="1"/>
-      <w:numFmt w:val="decimal"/>
-      <w:lvlText w:val="%1.%2.%3.%4.%5"/>
-      <w:lvlJc w:val="left"/>
-      <w:pPr>
-        <w:ind w:left="2551" w:hanging="850"/>
-      </w:pPr>
-    </w:lvl>
-    <w:lvl w:ilvl="5">
-      <w:start w:val="1"/>
-      <w:numFmt w:val="decimal"/>
-      <w:lvlText w:val="%1.%2.%3.%4.%5.%6"/>
-      <w:lvlJc w:val="left"/>
-      <w:pPr>
-        <w:ind w:left="3260" w:hanging="1134"/>
-      </w:pPr>
-    </w:lvl>
-    <w:lvl w:ilvl="6">
-      <w:start w:val="1"/>
-      <w:numFmt w:val="decimal"/>
-      <w:lvlText w:val="%1.%2.%3.%4.%5.%6.%7"/>
-      <w:lvlJc w:val="left"/>
-      <w:pPr>
-        <w:ind w:left="3827" w:hanging="1276"/>
-      </w:pPr>
-    </w:lvl>
-    <w:lvl w:ilvl="7">
-      <w:start w:val="1"/>
-      <w:numFmt w:val="decimal"/>
-      <w:lvlText w:val="%1.%2.%3.%4.%5.%6.%7.%8"/>
-      <w:lvlJc w:val="left"/>
-      <w:pPr>
-        <w:ind w:left="4394" w:hanging="1418"/>
-      </w:pPr>
-    </w:lvl>
-    <w:lvl w:ilvl="8">
-      <w:start w:val="1"/>
-      <w:numFmt w:val="decimal"/>
-      <w:lvlText w:val="%1.%2.%3.%4.%5.%6.%7.%8.%9"/>
-      <w:lvlJc w:val="left"/>
-      <w:pPr>
-        <w:ind w:left="5102" w:hanging="1700"/>
-      </w:pPr>
-    </w:lvl>
-  </w:abstractNum>
-  <w:abstractNum w:abstractNumId="2" w15:restartNumberingAfterBreak="0">
-    <w:nsid w:val="2D861EFF"/>
-    <w:multiLevelType w:val="multilevel"/>
-    <w:tmpl w:val="CC36D510"/>
-    <w:name w:val="WPSCNativeOutline2"/>
-    <w:lvl w:ilvl="0">
-      <w:start w:val="1"/>
-      <w:numFmt w:val="decimal"/>
-      <w:lvlRestart w:val="0"/>
-      <w:lvlText w:val="%1"/>
-      <w:lvlJc w:val="left"/>
-      <w:pPr>
-        <w:ind w:left="425" w:hanging="425"/>
-      </w:pPr>
-    </w:lvl>
-    <w:lvl w:ilvl="1">
-      <w:start w:val="1"/>
-      <w:numFmt w:val="decimal"/>
-      <w:lvlText w:val="%1.%2"/>
-      <w:lvlJc w:val="left"/>
-      <w:pPr>
-        <w:ind w:left="992" w:hanging="567"/>
-      </w:pPr>
-    </w:lvl>
-    <w:lvl w:ilvl="2">
-      <w:start w:val="1"/>
-      <w:numFmt w:val="decimal"/>
-      <w:lvlText w:val="%1.%2.%3"/>
-      <w:lvlJc w:val="left"/>
-      <w:pPr>
-        <w:ind w:left="1418" w:hanging="567"/>
-      </w:pPr>
-    </w:lvl>
-    <w:lvl w:ilvl="3">
-      <w:start w:val="1"/>
-      <w:numFmt w:val="decimal"/>
-      <w:lvlText w:val="%1.%2.%3.%4"/>
-      <w:lvlJc w:val="left"/>
-      <w:pPr>
-        <w:ind w:left="1984" w:hanging="708"/>
-      </w:pPr>
-    </w:lvl>
-    <w:lvl w:ilvl="4">
-      <w:start w:val="1"/>
-      <w:numFmt w:val="decimal"/>
-      <w:lvlText w:val="%1.%2.%3.%4.%5"/>
-      <w:lvlJc w:val="left"/>
-      <w:pPr>
-        <w:ind w:left="2551" w:hanging="850"/>
-      </w:pPr>
-    </w:lvl>
-    <w:lvl w:ilvl="5">
-      <w:start w:val="1"/>
-      <w:numFmt w:val="decimal"/>
-      <w:lvlText w:val="%1.%2.%3.%4.%5.%6"/>
-      <w:lvlJc w:val="left"/>
-      <w:pPr>
-        <w:ind w:left="3260" w:hanging="1134"/>
-      </w:pPr>
-    </w:lvl>
-    <w:lvl w:ilvl="6">
-      <w:start w:val="1"/>
-      <w:numFmt w:val="decimal"/>
-      <w:lvlText w:val="%1.%2.%3.%4.%5.%6.%7"/>
-      <w:lvlJc w:val="left"/>
-      <w:pPr>
-        <w:ind w:left="3827" w:hanging="1276"/>
-      </w:pPr>
-    </w:lvl>
-    <w:lvl w:ilvl="7">
-      <w:start w:val="1"/>
-      <w:numFmt w:val="decimal"/>
-      <w:lvlText w:val="%1.%2.%3.%4.%5.%6.%7.%8"/>
-      <w:lvlJc w:val="left"/>
-      <w:pPr>
-        <w:ind w:left="4394" w:hanging="1418"/>
-      </w:pPr>
-    </w:lvl>
-    <w:lvl w:ilvl="8">
-      <w:start w:val="1"/>
-      <w:numFmt w:val="decimal"/>
-      <w:lvlText w:val="%1.%2.%3.%4.%5.%6.%7.%8.%9"/>
-      <w:lvlJc w:val="left"/>
-      <w:pPr>
-        <w:ind w:left="5102" w:hanging="1700"/>
-      </w:pPr>
-    </w:lvl>
-  </w:abstractNum>
-  <w:abstractNum w:abstractNumId="3" w15:restartNumberingAfterBreak="0">
-    <w:nsid w:val="3EFF0FCE"/>
-    <w:multiLevelType w:val="multilevel"/>
-    <w:tmpl w:val="EEA6FF0C"/>
-    <w:name w:val="WPSCNativeOutline"/>
-    <w:lvl w:ilvl="0">
-      <w:start w:val="1"/>
-      <w:numFmt w:val="decimal"/>
-      <w:lvlRestart w:val="0"/>
-      <w:lvlText w:val="%1"/>
-      <w:lvlJc w:val="left"/>
-      <w:pPr>
-        <w:ind w:left="425" w:hanging="425"/>
-      </w:pPr>
-    </w:lvl>
-    <w:lvl w:ilvl="1">
-      <w:start w:val="1"/>
-      <w:numFmt w:val="decimal"/>
-      <w:lvlText w:val="%1.%2"/>
-      <w:lvlJc w:val="left"/>
-      <w:pPr>
-        <w:ind w:left="992" w:hanging="567"/>
-      </w:pPr>
-    </w:lvl>
-    <w:lvl w:ilvl="2">
-      <w:start w:val="1"/>
-      <w:numFmt w:val="decimal"/>
-      <w:lvlText w:val="%1.%2.%3"/>
-      <w:lvlJc w:val="left"/>
-      <w:pPr>
-        <w:ind w:left="1418" w:hanging="567"/>
-      </w:pPr>
-    </w:lvl>
-    <w:lvl w:ilvl="3">
-      <w:start w:val="1"/>
-      <w:numFmt w:val="decimal"/>
-      <w:lvlText w:val="%1.%2.%3.%4"/>
-      <w:lvlJc w:val="left"/>
-      <w:pPr>
-        <w:ind w:left="1984" w:hanging="708"/>
-      </w:pPr>
-    </w:lvl>
-    <w:lvl w:ilvl="4">
-      <w:start w:val="1"/>
-      <w:numFmt w:val="decimal"/>
-      <w:lvlText w:val="%1.%2.%3.%4.%5"/>
-      <w:lvlJc w:val="left"/>
-      <w:pPr>
-        <w:ind w:left="2551" w:hanging="850"/>
-      </w:pPr>
-    </w:lvl>
-    <w:lvl w:ilvl="5">
-      <w:start w:val="1"/>
-      <w:numFmt w:val="decimal"/>
-      <w:lvlText w:val="%1.%2.%3.%4.%5.%6"/>
-      <w:lvlJc w:val="left"/>
-      <w:pPr>
-        <w:ind w:left="3260" w:hanging="1134"/>
-      </w:pPr>
-    </w:lvl>
-    <w:lvl w:ilvl="6">
-      <w:start w:val="1"/>
-      <w:numFmt w:val="decimal"/>
-      <w:lvlText w:val="%1.%2.%3.%4.%5.%6.%7"/>
-      <w:lvlJc w:val="left"/>
-      <w:pPr>
-        <w:ind w:left="3827" w:hanging="1276"/>
-      </w:pPr>
-    </w:lvl>
-    <w:lvl w:ilvl="7">
-      <w:start w:val="1"/>
-      <w:numFmt w:val="decimal"/>
-      <w:lvlText w:val="%1.%2.%3.%4.%5.%6.%7.%8"/>
-      <w:lvlJc w:val="left"/>
-      <w:pPr>
-        <w:ind w:left="4394" w:hanging="1418"/>
-      </w:pPr>
-    </w:lvl>
-    <w:lvl w:ilvl="8">
-      <w:start w:val="1"/>
-      <w:numFmt w:val="decimal"/>
-      <w:lvlText w:val="%1.%2.%3.%4.%5.%6.%7.%8.%9"/>
-      <w:lvlJc w:val="left"/>
-      <w:pPr>
-        <w:ind w:left="5102" w:hanging="1700"/>
-      </w:pPr>
-    </w:lvl>
-  </w:abstractNum>
-  <w:abstractNum w:abstractNumId="4" w15:restartNumberingAfterBreak="0">
-    <w:nsid w:val="41686E56"/>
-    <w:multiLevelType w:val="multilevel"/>
-    <w:tmpl w:val="05585D3E"/>
-    <w:name w:val="WPSCNativeOutline222"/>
-    <w:lvl w:ilvl="0">
-      <w:start w:val="1"/>
-      <w:numFmt w:val="decimal"/>
-      <w:lvlRestart w:val="0"/>
-      <w:pStyle w:val="1"/>
-      <w:lvlText w:val="%1"/>
-      <w:lvlJc w:val="left"/>
-      <w:pPr>
-        <w:ind w:left="425" w:hanging="425"/>
-      </w:pPr>
-    </w:lvl>
-    <w:lvl w:ilvl="1">
-      <w:start w:val="1"/>
-      <w:numFmt w:val="decimal"/>
-      <w:pStyle w:val="2"/>
-      <w:lvlText w:val="%1.%2"/>
-      <w:lvlJc w:val="left"/>
-      <w:pPr>
-        <w:ind w:left="992" w:hanging="567"/>
-      </w:pPr>
-    </w:lvl>
-    <w:lvl w:ilvl="2">
-      <w:start w:val="1"/>
-      <w:numFmt w:val="decimal"/>
-      <w:pStyle w:val="3"/>
-      <w:lvlText w:val="%1.%2.%3"/>
-      <w:lvlJc w:val="left"/>
-      <w:pPr>
-        <w:ind w:left="1418" w:hanging="567"/>
-      </w:pPr>
-    </w:lvl>
-    <w:lvl w:ilvl="3">
-      <w:start w:val="1"/>
-      <w:numFmt w:val="decimal"/>
-      <w:lvlText w:val="%1.%2.%3.%4"/>
-      <w:lvlJc w:val="left"/>
-      <w:pPr>
-        <w:ind w:left="1984" w:hanging="708"/>
-      </w:pPr>
-    </w:lvl>
-    <w:lvl w:ilvl="4">
-      <w:start w:val="1"/>
-      <w:numFmt w:val="decimal"/>
-      <w:lvlText w:val="%1.%2.%3.%4.%5"/>
-      <w:lvlJc w:val="left"/>
-      <w:pPr>
-        <w:ind w:left="2551" w:hanging="850"/>
-      </w:pPr>
-    </w:lvl>
-    <w:lvl w:ilvl="5">
-      <w:start w:val="1"/>
-      <w:numFmt w:val="decimal"/>
-      <w:lvlText w:val="%1.%2.%3.%4.%5.%6"/>
-      <w:lvlJc w:val="left"/>
-      <w:pPr>
-        <w:ind w:left="3260" w:hanging="1134"/>
-      </w:pPr>
-    </w:lvl>
-    <w:lvl w:ilvl="6">
-      <w:start w:val="1"/>
-      <w:numFmt w:val="decimal"/>
-      <w:lvlText w:val="%1.%2.%3.%4.%5.%6.%7"/>
-      <w:lvlJc w:val="left"/>
-      <w:pPr>
-        <w:ind w:left="3827" w:hanging="1276"/>
-      </w:pPr>
-    </w:lvl>
-    <w:lvl w:ilvl="7">
-      <w:start w:val="1"/>
-      <w:numFmt w:val="decimal"/>
-      <w:lvlText w:val="%1.%2.%3.%4.%5.%6.%7.%8"/>
-      <w:lvlJc w:val="left"/>
-      <w:pPr>
-        <w:ind w:left="4394" w:hanging="1418"/>
-      </w:pPr>
-    </w:lvl>
-    <w:lvl w:ilvl="8">
-      <w:start w:val="1"/>
-      <w:numFmt w:val="decimal"/>
-      <w:lvlText w:val="%1.%2.%3.%4.%5.%6.%7.%8.%9"/>
-      <w:lvlJc w:val="left"/>
-      <w:pPr>
-        <w:ind w:left="5102" w:hanging="1700"/>
-      </w:pPr>
-    </w:lvl>
-  </w:abstractNum>
-  <w:num w:numId="1" w16cid:durableId="755594537">
+  <w:num w:numId="1" w16cid:durableId="951477802">
+    <w:abstractNumId w:val="0"/>
+  </w:num>
+  <w:num w:numId="2" w16cid:durableId="1397623829">
+    <w:abstractNumId w:val="2"/>
+  </w:num>
+  <w:num w:numId="3" w16cid:durableId="621036703">
     <w:abstractNumId w:val="3"/>
   </w:num>
-  <w:num w:numId="2" w16cid:durableId="932129255">
-    <w:abstractNumId w:val="2"/>
-  </w:num>
-  <w:num w:numId="3" w16cid:durableId="1276526489">
+  <w:num w:numId="4" w16cid:durableId="2030911829">
     <w:abstractNumId w:val="1"/>
   </w:num>
-  <w:num w:numId="4" w16cid:durableId="1406760989">
+  <w:num w:numId="5" w16cid:durableId="241260565">
     <w:abstractNumId w:val="4"/>
-  </w:num>
-  <w:num w:numId="5" w16cid:durableId="710107212">
-    <w:abstractNumId w:val="0"/>
   </w:num>
 </w:numbering>
 </file>
@@ -4951,12 +4951,12 @@
     <w:link w:val="10"/>
     <w:uiPriority w:val="9"/>
     <w:qFormat/>
-    <w:rsid w:val="00EF29AB"/>
+    <w:rsid w:val="009906E3"/>
     <w:pPr>
       <w:keepNext/>
       <w:keepLines/>
       <w:numPr>
-        <w:numId w:val="4"/>
+        <w:numId w:val="2"/>
       </w:numPr>
       <w:spacing w:before="320" w:after="100"/>
       <w:jc w:val="center"/>
@@ -4978,13 +4978,13 @@
     <w:uiPriority w:val="9"/>
     <w:unhideWhenUsed/>
     <w:qFormat/>
-    <w:rsid w:val="00EF29AB"/>
+    <w:rsid w:val="009906E3"/>
     <w:pPr>
       <w:keepNext/>
       <w:keepLines/>
       <w:numPr>
         <w:ilvl w:val="1"/>
-        <w:numId w:val="4"/>
+        <w:numId w:val="3"/>
       </w:numPr>
       <w:spacing w:before="280" w:after="100"/>
       <w:outlineLvl w:val="1"/>
@@ -5005,7 +5005,7 @@
     <w:uiPriority w:val="9"/>
     <w:unhideWhenUsed/>
     <w:qFormat/>
-    <w:rsid w:val="00EF29AB"/>
+    <w:rsid w:val="009906E3"/>
     <w:pPr>
       <w:keepNext/>
       <w:keepLines/>
@@ -5032,7 +5032,7 @@
     <w:uiPriority w:val="9"/>
     <w:unhideWhenUsed/>
     <w:qFormat/>
-    <w:rsid w:val="00EF29AB"/>
+    <w:rsid w:val="009906E3"/>
     <w:pPr>
       <w:keepNext/>
       <w:keepLines/>
@@ -5059,7 +5059,7 @@
     <w:uiPriority w:val="9"/>
     <w:unhideWhenUsed/>
     <w:qFormat/>
-    <w:rsid w:val="00EF29AB"/>
+    <w:rsid w:val="009906E3"/>
     <w:pPr>
       <w:keepNext/>
       <w:keepLines/>
@@ -5081,7 +5081,7 @@
     <w:uiPriority w:val="9"/>
     <w:unhideWhenUsed/>
     <w:qFormat/>
-    <w:rsid w:val="00EF29AB"/>
+    <w:rsid w:val="009906E3"/>
     <w:pPr>
       <w:keepNext/>
       <w:keepLines/>
@@ -5105,7 +5105,7 @@
     <w:semiHidden/>
     <w:unhideWhenUsed/>
     <w:qFormat/>
-    <w:rsid w:val="00EF29AB"/>
+    <w:rsid w:val="009906E3"/>
     <w:pPr>
       <w:keepNext/>
       <w:keepLines/>
@@ -5128,7 +5128,7 @@
     <w:semiHidden/>
     <w:unhideWhenUsed/>
     <w:qFormat/>
-    <w:rsid w:val="00EF29AB"/>
+    <w:rsid w:val="009906E3"/>
     <w:pPr>
       <w:keepNext/>
       <w:keepLines/>
@@ -5149,7 +5149,7 @@
     <w:semiHidden/>
     <w:unhideWhenUsed/>
     <w:qFormat/>
-    <w:rsid w:val="00EF29AB"/>
+    <w:rsid w:val="009906E3"/>
     <w:pPr>
       <w:keepNext/>
       <w:keepLines/>
@@ -5193,7 +5193,7 @@
     <w:basedOn w:val="a0"/>
     <w:link w:val="1"/>
     <w:uiPriority w:val="9"/>
-    <w:rsid w:val="00EF29AB"/>
+    <w:rsid w:val="009906E3"/>
     <w:rPr>
       <w:rFonts w:ascii="Times New Roman" w:eastAsia="黑体" w:hAnsi="Times New Roman" w:cs="Times New Roman"/>
       <w:b/>
@@ -5207,7 +5207,7 @@
     <w:basedOn w:val="a0"/>
     <w:link w:val="2"/>
     <w:uiPriority w:val="9"/>
-    <w:rsid w:val="00EF29AB"/>
+    <w:rsid w:val="009906E3"/>
     <w:rPr>
       <w:rFonts w:ascii="Times New Roman" w:eastAsia="黑体" w:hAnsi="Times New Roman" w:cs="Times New Roman"/>
       <w:b/>
@@ -5221,7 +5221,7 @@
     <w:basedOn w:val="a0"/>
     <w:link w:val="3"/>
     <w:uiPriority w:val="9"/>
-    <w:rsid w:val="00EF29AB"/>
+    <w:rsid w:val="009906E3"/>
     <w:rPr>
       <w:rFonts w:ascii="Times New Roman" w:eastAsia="黑体" w:hAnsi="Times New Roman" w:cs="Times New Roman"/>
       <w:b/>
@@ -5235,7 +5235,7 @@
     <w:basedOn w:val="a0"/>
     <w:link w:val="4"/>
     <w:uiPriority w:val="9"/>
-    <w:rsid w:val="00EF29AB"/>
+    <w:rsid w:val="009906E3"/>
     <w:rPr>
       <w:rFonts w:ascii="Times New Roman" w:eastAsia="黑体" w:hAnsi="Times New Roman" w:cs="Times New Roman"/>
       <w:b/>
@@ -5249,7 +5249,7 @@
     <w:basedOn w:val="a0"/>
     <w:link w:val="5"/>
     <w:uiPriority w:val="9"/>
-    <w:rsid w:val="00EF29AB"/>
+    <w:rsid w:val="009906E3"/>
     <w:rPr>
       <w:rFonts w:ascii="Times New Roman" w:eastAsia="黑体" w:hAnsi="Times New Roman" w:cs="Times New Roman"/>
       <w:b/>
@@ -5262,7 +5262,7 @@
     <w:basedOn w:val="a0"/>
     <w:link w:val="6"/>
     <w:uiPriority w:val="9"/>
-    <w:rsid w:val="00EF29AB"/>
+    <w:rsid w:val="009906E3"/>
     <w:rPr>
       <w:rFonts w:ascii="Times New Roman" w:eastAsia="黑体" w:hAnsi="Times New Roman" w:cs="Times New Roman"/>
       <w:b/>
@@ -5277,7 +5277,7 @@
     <w:link w:val="7"/>
     <w:uiPriority w:val="9"/>
     <w:semiHidden/>
-    <w:rsid w:val="00EF29AB"/>
+    <w:rsid w:val="009906E3"/>
     <w:rPr>
       <w:rFonts w:cstheme="majorBidi"/>
       <w:b/>
@@ -5291,7 +5291,7 @@
     <w:link w:val="8"/>
     <w:uiPriority w:val="9"/>
     <w:semiHidden/>
-    <w:rsid w:val="00EF29AB"/>
+    <w:rsid w:val="009906E3"/>
     <w:rPr>
       <w:rFonts w:cstheme="majorBidi"/>
       <w:color w:val="595959" w:themeColor="text1" w:themeTint="A6"/>
@@ -5303,7 +5303,7 @@
     <w:link w:val="9"/>
     <w:uiPriority w:val="9"/>
     <w:semiHidden/>
-    <w:rsid w:val="00EF29AB"/>
+    <w:rsid w:val="009906E3"/>
     <w:rPr>
       <w:rFonts w:eastAsiaTheme="majorEastAsia" w:cstheme="majorBidi"/>
       <w:color w:val="595959" w:themeColor="text1" w:themeTint="A6"/>
@@ -5316,7 +5316,7 @@
     <w:link w:val="a4"/>
     <w:uiPriority w:val="10"/>
     <w:qFormat/>
-    <w:rsid w:val="00EF29AB"/>
+    <w:rsid w:val="009906E3"/>
     <w:pPr>
       <w:spacing w:after="80" w:line="240" w:lineRule="auto"/>
       <w:contextualSpacing/>
@@ -5336,7 +5336,7 @@
     <w:basedOn w:val="a0"/>
     <w:link w:val="a3"/>
     <w:uiPriority w:val="10"/>
-    <w:rsid w:val="00EF29AB"/>
+    <w:rsid w:val="009906E3"/>
     <w:rPr>
       <w:rFonts w:ascii="Times New Roman" w:eastAsia="黑体" w:hAnsi="Times New Roman" w:cs="Times New Roman"/>
       <w:b/>
@@ -5353,7 +5353,7 @@
     <w:link w:val="a6"/>
     <w:uiPriority w:val="11"/>
     <w:qFormat/>
-    <w:rsid w:val="00EF29AB"/>
+    <w:rsid w:val="009906E3"/>
     <w:pPr>
       <w:numPr>
         <w:ilvl w:val="1"/>
@@ -5373,7 +5373,7 @@
     <w:basedOn w:val="a0"/>
     <w:link w:val="a5"/>
     <w:uiPriority w:val="11"/>
-    <w:rsid w:val="00EF29AB"/>
+    <w:rsid w:val="009906E3"/>
     <w:rPr>
       <w:rFonts w:asciiTheme="majorHAnsi" w:eastAsiaTheme="majorEastAsia" w:hAnsiTheme="majorHAnsi" w:cstheme="majorBidi"/>
       <w:color w:val="595959" w:themeColor="text1" w:themeTint="A6"/>
@@ -5389,7 +5389,7 @@
     <w:link w:val="a8"/>
     <w:uiPriority w:val="29"/>
     <w:qFormat/>
-    <w:rsid w:val="00EF29AB"/>
+    <w:rsid w:val="009906E3"/>
     <w:pPr>
       <w:spacing w:before="160"/>
       <w:jc w:val="center"/>
@@ -5405,7 +5405,7 @@
     <w:basedOn w:val="a0"/>
     <w:link w:val="a7"/>
     <w:uiPriority w:val="29"/>
-    <w:rsid w:val="00EF29AB"/>
+    <w:rsid w:val="009906E3"/>
     <w:rPr>
       <w:i/>
       <w:iCs/>
@@ -5417,7 +5417,7 @@
     <w:basedOn w:val="a"/>
     <w:uiPriority w:val="34"/>
     <w:qFormat/>
-    <w:rsid w:val="00EF29AB"/>
+    <w:rsid w:val="009906E3"/>
     <w:pPr>
       <w:ind w:left="720"/>
       <w:contextualSpacing/>
@@ -5428,7 +5428,7 @@
     <w:basedOn w:val="a0"/>
     <w:uiPriority w:val="21"/>
     <w:qFormat/>
-    <w:rsid w:val="00EF29AB"/>
+    <w:rsid w:val="009906E3"/>
     <w:rPr>
       <w:i/>
       <w:iCs/>
@@ -5442,7 +5442,7 @@
     <w:link w:val="ac"/>
     <w:uiPriority w:val="30"/>
     <w:qFormat/>
-    <w:rsid w:val="00EF29AB"/>
+    <w:rsid w:val="009906E3"/>
     <w:pPr>
       <w:pBdr>
         <w:top w:val="single" w:sz="4" w:space="10" w:color="2F5496" w:themeColor="accent1" w:themeShade="BF"/>
@@ -5463,7 +5463,7 @@
     <w:basedOn w:val="a0"/>
     <w:link w:val="ab"/>
     <w:uiPriority w:val="30"/>
-    <w:rsid w:val="00EF29AB"/>
+    <w:rsid w:val="009906E3"/>
     <w:rPr>
       <w:i/>
       <w:iCs/>
@@ -5475,7 +5475,7 @@
     <w:basedOn w:val="a0"/>
     <w:uiPriority w:val="32"/>
     <w:qFormat/>
-    <w:rsid w:val="00EF29AB"/>
+    <w:rsid w:val="009906E3"/>
     <w:rPr>
       <w:b/>
       <w:bCs/>
@@ -5490,7 +5490,7 @@
     <w:link w:val="af"/>
     <w:uiPriority w:val="99"/>
     <w:unhideWhenUsed/>
-    <w:rsid w:val="00C06241"/>
+    <w:rsid w:val="00294E25"/>
     <w:pPr>
       <w:spacing w:after="120" w:line="360" w:lineRule="auto"/>
       <w:ind w:firstLine="480"/>
@@ -5506,7 +5506,7 @@
     <w:basedOn w:val="a0"/>
     <w:link w:val="ae"/>
     <w:uiPriority w:val="99"/>
-    <w:rsid w:val="00C06241"/>
+    <w:rsid w:val="00294E25"/>
     <w:rPr>
       <w:rFonts w:ascii="Times New Roman" w:eastAsia="仿宋" w:hAnsi="Times New Roman" w:cs="Times New Roman"/>
       <w:sz w:val="24"/>
@@ -5519,7 +5519,7 @@
     <w:autoRedefine/>
     <w:uiPriority w:val="39"/>
     <w:unhideWhenUsed/>
-    <w:rsid w:val="00C06241"/>
+    <w:rsid w:val="00294E25"/>
     <w:pPr>
       <w:spacing w:after="0"/>
     </w:pPr>
@@ -5534,7 +5534,7 @@
     <w:autoRedefine/>
     <w:uiPriority w:val="39"/>
     <w:unhideWhenUsed/>
-    <w:rsid w:val="00C06241"/>
+    <w:rsid w:val="00294E25"/>
     <w:pPr>
       <w:spacing w:after="0"/>
       <w:ind w:leftChars="200" w:left="420"/>
@@ -5550,7 +5550,7 @@
     <w:autoRedefine/>
     <w:uiPriority w:val="39"/>
     <w:unhideWhenUsed/>
-    <w:rsid w:val="00C06241"/>
+    <w:rsid w:val="00294E25"/>
     <w:pPr>
       <w:spacing w:after="0"/>
       <w:ind w:leftChars="400" w:left="840"/>
@@ -5566,7 +5566,7 @@
     <w:uiPriority w:val="39"/>
     <w:unhideWhenUsed/>
     <w:qFormat/>
-    <w:rsid w:val="00C06241"/>
+    <w:rsid w:val="00294E25"/>
     <w:pPr>
       <w:numPr>
         <w:numId w:val="0"/>
@@ -5590,7 +5590,7 @@
     <w:link w:val="af1"/>
     <w:uiPriority w:val="99"/>
     <w:unhideWhenUsed/>
-    <w:rsid w:val="00C06241"/>
+    <w:rsid w:val="00294E25"/>
     <w:pPr>
       <w:tabs>
         <w:tab w:val="center" w:pos="4153"/>
@@ -5610,7 +5610,7 @@
     <w:basedOn w:val="a0"/>
     <w:link w:val="af0"/>
     <w:uiPriority w:val="99"/>
-    <w:rsid w:val="00C06241"/>
+    <w:rsid w:val="00294E25"/>
     <w:rPr>
       <w:sz w:val="18"/>
       <w:szCs w:val="18"/>
@@ -5622,7 +5622,7 @@
     <w:link w:val="af3"/>
     <w:uiPriority w:val="99"/>
     <w:unhideWhenUsed/>
-    <w:rsid w:val="00C06241"/>
+    <w:rsid w:val="00294E25"/>
     <w:pPr>
       <w:tabs>
         <w:tab w:val="center" w:pos="4153"/>
@@ -5641,7 +5641,7 @@
     <w:basedOn w:val="a0"/>
     <w:link w:val="af2"/>
     <w:uiPriority w:val="99"/>
-    <w:rsid w:val="00C06241"/>
+    <w:rsid w:val="00294E25"/>
     <w:rPr>
       <w:sz w:val="18"/>
       <w:szCs w:val="18"/>
@@ -5652,7 +5652,7 @@
     <w:basedOn w:val="a0"/>
     <w:uiPriority w:val="99"/>
     <w:unhideWhenUsed/>
-    <w:rsid w:val="00C06241"/>
+    <w:rsid w:val="00294E25"/>
     <w:rPr>
       <w:color w:val="0563C1" w:themeColor="hyperlink"/>
       <w:u w:val="single"/>

</xml_diff>